<commit_message>
Add ARIMA diagnostics and thesis updates
</commit_message>
<xml_diff>
--- a/bukuThesis/laporan_progres_pipeline_flf_bilstm_eurusd.docx
+++ b/bukuThesis/laporan_progres_pipeline_flf_bilstm_eurusd.docx
@@ -71,7 +71,7 @@
     <w:p/>
     <w:p>
       <w:r>
-        <w:t xml:space="preserve">Dokumen ini belum membahas baseline ARIMA dan FLF-LSTM murni secara lengkap karena kedua jalur tersebut belum memiliki runner, validasi, dan report yang setara dengan jalur BiLSTM utama.</w:t>
+        <w:t xml:space="preserve">Catatan pembaruan: pada tahap terbaru penelitian, baseline ARIMA dan jalur FLF-LSTM sudah berhasil dioperasionalkan pada skema komparatif walk-forward 72 bulan train / 1 bulan test untuk lima fold terakhir (17-21). Namun, dokumen ini tetap difokuskan pada jalur implementasi FLF-BiLSTM sebagai cabang eksperimen yang paling matang dari sisi pipeline dan artefak visual.</w:t>
       </w:r>
     </w:p>
     <w:p/>
@@ -2312,23 +2312,18 @@
     <w:p/>
     <w:p>
       <w:r>
-        <w:t xml:space="preserve">Walaupun jalur FLF-BiLSTM sudah kuat, ada beberapa bagian proposal yang belum sepenuhnya selesai dalam cabang implementasi ini:</w:t>
-      </w:r>
-    </w:p>
-    <w:p/>
-    <w:p>
-      <w:r>
-        <w:t xml:space="preserve">- baseline ARIMA belum menjadi pipeline operasional utama,</w:t>
-      </w:r>
-    </w:p>
-    <w:p>
-      <w:r>
-        <w:t xml:space="preserve">- FLF-LSTM sudah tersedia untuk pembanding pada skema tertentu, tetapi belum seluruhnya diparalelkan untuk semua horizon, timeframe, dan report seperti jalur BiLSTM utama,</w:t>
-      </w:r>
-    </w:p>
-    <w:p>
-      <w:r>
-        <w:t xml:space="preserve">- metrik Squared Correlation (Pearson corr²) dan Directional Accuracy sudah mulai diintegrasikan pada report komparatif, tetapi belum menjadi evaluator utama yang konsisten di seluruh report,</w:t>
+        <w:t xml:space="preserve">Walaupun jalur FLF-BiLSTM sudah kuat, masih ada beberapa bagian proposal yang belum sepenuhnya selesai sebagai paket penelitian final:</w:t>
+      </w:r>
+    </w:p>
+    <w:p/>
+    <w:p>
+      <w:r>
+        <w:t xml:space="preserve">- baseline ARIMA dan FLF-LSTM sudah operasional pada skema komparatif utama 72 bulan/1 bulan, tetapi belum seluruhnya diperluas ke semua horizon, timeframe, dan variasi report seperti jalur BiLSTM,</w:t>
+      </w:r>
+    </w:p>
+    <w:p>
+      <w:r>
+        <w:t xml:space="preserve">- metrik Squared Correlation (Pearson corr²) dan Directional Accuracy sudah diintegrasikan pada report komparatif utama, tetapi belum menjadi evaluator yang sepenuhnya seragam di seluruh report lama,</w:t>
       </w:r>
     </w:p>
     <w:p>
@@ -2338,7 +2333,12 @@
     </w:p>
     <w:p>
       <w:r>
-        <w:t xml:space="preserve">- fitur teknikal tambahan (RSI, MACD, ATR) belum menjadi cabang final utama pada pipeline EURUSD inti.</w:t>
+        <w:t xml:space="preserve">- fitur teknikal tambahan (RSI, MACD, ATR) belum menjadi cabang final utama pada pipeline EURUSD inti,</w:t>
+      </w:r>
+    </w:p>
+    <w:p>
+      <w:r>
+        <w:t xml:space="preserve">- sinkronisasi seluruh dokumen laporan/proposal terhadap hasil komparatif tiga model masih perlu dijaga agar narasinya tidak tertinggal dari implementasi terbaru.</w:t>
       </w:r>
     </w:p>
     <w:p/>
@@ -2365,7 +2365,7 @@
     <w:p/>
     <w:p>
       <w:r>
-        <w:t xml:space="preserve">Dengan demikian, untuk kebutuhan laporan progres tesis, cabang ini sudah cukup kuat untuk dipresentasikan sebagai hasil implementasi utama yang telah berjalan. Tahap penelitian berikutnya secara logis adalah melengkapi baseline pembanding dan evaluator tambahan agar keseluruhan desain eksperimen dalam proposal dapat terpenuhi sepenuhnya.</w:t>
+        <w:t xml:space="preserve">Pada tahap terbaru, pipeline tersebut juga sudah berhasil ditempatkan dalam pembandingan yang fair terhadap FLF-LSTM dan baseline statistik ARIMA pada skenario utama walk-forward 72 bulan train / 1 bulan test untuk lima fold terakhir. Hasil komparatif menunjukkan bahwa FLF-BiLSTM tetap lebih baik daripada ARIMA, walaupun pada skenario tersebut FLF-LSTM memberikan performa agregat terbaik. Dengan demikian, posisi FLF-BiLSTM dalam penelitian ini tetap kuat sebagai model pembanding arsitektural yang matang dan sahih secara eksperimental.</w:t>
       </w:r>
     </w:p>
     <w:p/>
@@ -2386,32 +2386,27 @@
     <w:p/>
     <w:p>
       <w:r>
-        <w:t xml:space="preserve">1. merapikan satu baseline eksperimen final FLF-BiLSTM yang dijadikan acuan,</w:t>
-      </w:r>
-    </w:p>
-    <w:p>
-      <w:r>
-        <w:t xml:space="preserve">2. memperluas baseline FLF-LSTM agar setara pada lebih banyak skema validasi dan report,</w:t>
-      </w:r>
-    </w:p>
-    <w:p>
-      <w:r>
-        <w:t xml:space="preserve">3. menambahkan baseline ARIMA,</w:t>
-      </w:r>
-    </w:p>
-    <w:p>
-      <w:r>
-        <w:t xml:space="preserve">4. menyebarkan evaluator Directional Accuracy dan Squared Correlation (Pearson corr²) ke seluruh report utama,</w:t>
-      </w:r>
-    </w:p>
-    <w:p>
-      <w:r>
-        <w:t xml:space="preserve">5. menutup komparasi 4H vs 1D,</w:t>
-      </w:r>
-    </w:p>
-    <w:p>
-      <w:r>
-        <w:t xml:space="preserve">6. baru setelah itu memperluas eksperimen dengan indikator teknikal tambahan.</w:t>
+        <w:t xml:space="preserve">1. merapikan satu baseline eksperimen final tiga model yang dijadikan acuan laporan tesis,</w:t>
+      </w:r>
+    </w:p>
+    <w:p>
+      <w:r>
+        <w:t xml:space="preserve">2. memperluas evaluasi ke timeframe 1D dengan protokol yang setara,</w:t>
+      </w:r>
+    </w:p>
+    <w:p>
+      <w:r>
+        <w:t xml:space="preserve">3. menyeragamkan evaluator Directional Accuracy dan Squared Correlation (Pearson corr²) pada seluruh report utama,</w:t>
+      </w:r>
+    </w:p>
+    <w:p>
+      <w:r>
+        <w:t xml:space="preserve">4. menutup komparasi 4H vs 1D,</w:t>
+      </w:r>
+    </w:p>
+    <w:p>
+      <w:r>
+        <w:t xml:space="preserve">5. baru setelah itu memperluas eksperimen dengan indikator teknikal tambahan.</w:t>
       </w:r>
     </w:p>
     <w:p/>

</xml_diff>